<commit_message>
Align Topic 2.5 with OCR J277 and restore the standard experience player
Replace assembly-instruction enrichment with language-choice content, focus IDE activities on specified facilities, and rebuild matching worksheets and lesson slides. Use the established panorama renderer and verify scoring, saved progress and review mode.
</commit_message>
<xml_diff>
--- a/worksheets/PL_L01_LanguageLevelLab_Worksheet.docx
+++ b/worksheets/PL_L01_LanguageLevelLab_Worksheet.docx
@@ -437,7 +437,7 @@
                 <w:sz w:val="21"/>
                 <w:szCs w:val="21"/>
               </w:rPr>
-              <w:t>Distinguish source code, assembly and machine code.</w:t>
+              <w:t>Explain why high-level source needs translation.</w:t>
             </w:r>
           </w:p>
           <w:p>
@@ -1383,7 +1383,7 @@
                 <w:sz w:val="21"/>
                 <w:szCs w:val="21"/>
               </w:rPr>
-              <w:t>The Python example calculates 4 + 7. What does print(total) output?</w:t>
+              <w:t>Which feature of the Python example illustrates a high-level language?</w:t>
             </w:r>
           </w:p>
           <w:tbl>
@@ -2722,7 +2722,7 @@
                 <w:sz w:val="26"/>
                 <w:szCs w:val="26"/>
               </w:rPr>
-              <w:t>4   Assembly language</w:t>
+              <w:t>4   The need for translation</w:t>
             </w:r>
             <w:r>
               <w:rPr>
@@ -2855,7 +2855,7 @@
                 <w:sz w:val="21"/>
                 <w:szCs w:val="21"/>
               </w:rPr>
-              <w:t>Why is assembly low-level even though it uses words?</w:t>
+              <w:t>Why does high-level source need translation?</w:t>
             </w:r>
           </w:p>
           <w:tbl>
@@ -2961,7 +2961,76 @@
                 <w:sz w:val="21"/>
                 <w:szCs w:val="21"/>
               </w:rPr>
-              <w:t>Match the description to the correct term.</w:t>
+              <w:t>Why is a translator needed for high-level source?</w:t>
+            </w:r>
+          </w:p>
+          <w:tbl>
+            <w:tblPr>
+              <w:tblW w:type="dxa" w:w="10026"/>
+              <w:tblBorders>
+                <w:top w:val="single" w:color="auto" w:sz="4"/>
+                <w:left w:val="single" w:color="auto" w:sz="4"/>
+                <w:bottom w:val="single" w:color="auto" w:sz="4"/>
+                <w:right w:val="single" w:color="auto" w:sz="4"/>
+                <w:insideH w:val="single" w:color="auto" w:sz="4"/>
+                <w:insideV w:val="single" w:color="auto" w:sz="4"/>
+              </w:tblBorders>
+            </w:tblPr>
+            <w:tblGrid>
+              <w:gridCol w:w="10026"/>
+            </w:tblGrid>
+            <w:tr>
+              <w:trPr>
+                <w:cantSplit/>
+                <w:trHeight w:val="460" w:hRule="atLeast"/>
+              </w:trPr>
+              <w:tc>
+                <w:tcPr>
+                  <w:tcW w:type="dxa" w:w="10026"/>
+                  <w:tcBorders>
+                    <w:top w:val="none" w:color="FFFFFF" w:sz="0"/>
+                    <w:left w:val="none" w:color="FFFFFF" w:sz="0"/>
+                    <w:bottom w:val="dotted" w:color="9AA8BC" w:sz="6"/>
+                    <w:right w:val="none" w:color="FFFFFF" w:sz="0"/>
+                  </w:tcBorders>
+                  <w:tcMar>
+                    <w:left w:type="dxa" w:w="0"/>
+                    <w:bottom w:type="dxa" w:w="20"/>
+                    <w:right w:type="dxa" w:w="0"/>
+                  </w:tcMar>
+                  <w:vAlign w:val="bottom"/>
+                </w:tcPr>
+                <w:p>
+                  <w:pPr>
+                    <w:spacing w:after="0" w:before="0"/>
+                  </w:pPr>
+                  <w:r>
+                    <w:rPr>
+                      <w:rFonts w:ascii="Arial" w:cs="Arial" w:eastAsia="Arial" w:hAnsi="Arial"/>
+                      <w:color w:val="5A6B85"/>
+                      <w:sz w:val="21"/>
+                      <w:szCs w:val="21"/>
+                    </w:rPr>
+                    <w:t xml:space="preserve"/>
+                  </w:r>
+                </w:p>
+              </w:tc>
+            </w:tr>
+          </w:tbl>
+          <w:p>
+            <w:pPr>
+              <w:keepNext/>
+              <w:spacing w:after="60" w:before="120"/>
+            </w:pPr>
+            <w:r>
+              <w:rPr>
+                <w:rFonts w:ascii="Arial" w:cs="Arial" w:eastAsia="Arial" w:hAnsi="Arial"/>
+                <w:b/>
+                <w:bCs/>
+                <w:sz w:val="21"/>
+                <w:szCs w:val="21"/>
+              </w:rPr>
+              <w:t>Match each term to its role.</w:t>
             </w:r>
           </w:p>
           <w:p>
@@ -2995,7 +3064,7 @@
                 <w:sz w:val="19"/>
                 <w:szCs w:val="19"/>
               </w:rPr>
-              <w:t>Source code / Machine code / Mnemonics</w:t>
+              <w:t>Instructions a compatible CPU executes / Processes source into executable instructions / The program text written by a programmer</w:t>
             </w:r>
           </w:p>
           <w:tbl>
@@ -3122,7 +3191,7 @@
                       <w:sz w:val="20"/>
                       <w:szCs w:val="20"/>
                     </w:rPr>
-                    <w:t>Short instruction names such as ADD</w:t>
+                    <w:t>Source code</w:t>
                   </w:r>
                 </w:p>
               </w:tc>
@@ -3193,7 +3262,7 @@
                       <w:sz w:val="20"/>
                       <w:szCs w:val="20"/>
                     </w:rPr>
-                    <w:t>Binary instructions executed by a CPU</w:t>
+                    <w:t>Translator</w:t>
                   </w:r>
                 </w:p>
               </w:tc>
@@ -3264,7 +3333,7 @@
                       <w:sz w:val="20"/>
                       <w:szCs w:val="20"/>
                     </w:rPr>
-                    <w:t>Human-written program before translation</w:t>
+                    <w:t>Machine code</w:t>
                   </w:r>
                 </w:p>
               </w:tc>
@@ -3297,75 +3366,6 @@
                       <w:sz w:val="20"/>
                       <w:szCs w:val="20"/>
                     </w:rPr>
-                  </w:r>
-                </w:p>
-              </w:tc>
-            </w:tr>
-          </w:tbl>
-          <w:p>
-            <w:pPr>
-              <w:keepNext/>
-              <w:spacing w:after="60" w:before="120"/>
-            </w:pPr>
-            <w:r>
-              <w:rPr>
-                <w:rFonts w:ascii="Arial" w:cs="Arial" w:eastAsia="Arial" w:hAnsi="Arial"/>
-                <w:b/>
-                <w:bCs/>
-                <w:sz w:val="21"/>
-                <w:szCs w:val="21"/>
-              </w:rPr>
-              <w:t>A simplified example loads 4 into R0, then adds 7 to R0. What value is now in R0?</w:t>
-            </w:r>
-          </w:p>
-          <w:tbl>
-            <w:tblPr>
-              <w:tblW w:type="dxa" w:w="10026"/>
-              <w:tblBorders>
-                <w:top w:val="single" w:color="auto" w:sz="4"/>
-                <w:left w:val="single" w:color="auto" w:sz="4"/>
-                <w:bottom w:val="single" w:color="auto" w:sz="4"/>
-                <w:right w:val="single" w:color="auto" w:sz="4"/>
-                <w:insideH w:val="single" w:color="auto" w:sz="4"/>
-                <w:insideV w:val="single" w:color="auto" w:sz="4"/>
-              </w:tblBorders>
-            </w:tblPr>
-            <w:tblGrid>
-              <w:gridCol w:w="10026"/>
-            </w:tblGrid>
-            <w:tr>
-              <w:trPr>
-                <w:cantSplit/>
-                <w:trHeight w:val="460" w:hRule="atLeast"/>
-              </w:trPr>
-              <w:tc>
-                <w:tcPr>
-                  <w:tcW w:type="dxa" w:w="10026"/>
-                  <w:tcBorders>
-                    <w:top w:val="none" w:color="FFFFFF" w:sz="0"/>
-                    <w:left w:val="none" w:color="FFFFFF" w:sz="0"/>
-                    <w:bottom w:val="dotted" w:color="9AA8BC" w:sz="6"/>
-                    <w:right w:val="none" w:color="FFFFFF" w:sz="0"/>
-                  </w:tcBorders>
-                  <w:tcMar>
-                    <w:left w:type="dxa" w:w="0"/>
-                    <w:bottom w:type="dxa" w:w="20"/>
-                    <w:right w:type="dxa" w:w="0"/>
-                  </w:tcMar>
-                  <w:vAlign w:val="bottom"/>
-                </w:tcPr>
-                <w:p>
-                  <w:pPr>
-                    <w:spacing w:after="0" w:before="0"/>
-                  </w:pPr>
-                  <w:r>
-                    <w:rPr>
-                      <w:rFonts w:ascii="Arial" w:cs="Arial" w:eastAsia="Arial" w:hAnsi="Arial"/>
-                      <w:color w:val="5A6B85"/>
-                      <w:sz w:val="21"/>
-                      <w:szCs w:val="21"/>
-                    </w:rPr>
-                    <w:t xml:space="preserve"/>
                   </w:r>
                 </w:p>
               </w:tc>
@@ -3890,7 +3890,7 @@
                       <w:sz w:val="20"/>
                       <w:szCs w:val="20"/>
                     </w:rPr>
-                    <w:t>Python source needs a suitable runtime on the new system</w:t>
+                    <w:t>Python source needs a suitable interpreter on the new system</w:t>
                   </w:r>
                 </w:p>
               </w:tc>
@@ -4103,7 +4103,7 @@
                       <w:sz w:val="20"/>
                       <w:szCs w:val="20"/>
                     </w:rPr>
-                    <w:t>High-level code can depend on libraries that must also be available</w:t>
+                    <w:t>A suitable translator must be available on the new system</w:t>
                   </w:r>
                 </w:p>
               </w:tc>
@@ -5147,7 +5147,7 @@
                 <w:sz w:val="19"/>
                 <w:szCs w:val="19"/>
               </w:rPr>
-              <w:t>A compatible runtime and dependencies are available / Direct control of processor operations / Easier to read and maintain</w:t>
+              <w:t>A compatible translator is available / Direct control of processor operations / Easier to read and maintain</w:t>
             </w:r>
           </w:p>
           <w:tbl>
@@ -6323,7 +6323,7 @@
                 <w:sz w:val="21"/>
                 <w:szCs w:val="21"/>
               </w:rPr>
-              <w:t>b)  State one difference between assembly and machine code. [2]</w:t>
+              <w:t>b)  Explain one difference between high-level and low-level languages. [2]</w:t>
             </w:r>
             <w:r>
               <w:rPr>
@@ -7018,7 +7018,7 @@
                       <w:sz w:val="20"/>
                       <w:szCs w:val="20"/>
                     </w:rPr>
-                    <w:t>Distinguish source code, assembly and machine code.</w:t>
+                    <w:t>Explain why high-level source needs translation.</w:t>
                   </w:r>
                 </w:p>
               </w:tc>

</xml_diff>